<commit_message>
Refresh tracked-changes manuscript against original upload
Co-Authored-By: Claude Sonnet 5.5 <noreply@anthropic.com>
Claude-Session: https://claude.ai/code/session_01Y1g9vByMLTE8eGJ9K81zt6
</commit_message>
<xml_diff>
--- a/review_response/Manuscript_AS_tracked_changes.docx
+++ b/review_response/Manuscript_AS_tracked_changes.docx
@@ -301,7 +301,7 @@
       <w:r>
         <w:t xml:space="preserve">Zinc (Zn) is a promising biodegradable metal for temporary implants, yet predictive computational frameworks for its degradation under physiological conditions remain limited. In this study, a three-dimensional (3D) mechanistic reaction-diffusion model is developed by coupling oxygen reduction reaction (ORR) kinetics, mass transport, corrosion-product evolution, and moving-interface tracking. Initial sensitivity analysis demonstrates that dissolved oxygen availability primarily controls Zn biodegradation. Calibrated</w:t>
       </w:r>
-      <w:del w:id="9008" w:author="Claude" w:date="2026-10-08T03:09:32Z">
+      <w:del w:id="9008" w:author="Claude" w:date="2026-10-08T04:28:24Z">
         <w:r>
           <w:delText xml:space="preserve"> using three effective kinetic parameters</w:delText>
         </w:r>
@@ -309,12 +309,12 @@
       <w:r>
         <w:t xml:space="preserve"> against literature immersion mass-loss data over 14 days, the model predicts the 28-day mass-loss evolution measured in this study, yielding a root-mean-square error (RMSE) of 0.0159%. The simulations reveal a self-limiting mechanism in which corrosion-product accumulation progressively restricts oxygen transport to the metal surface, driving a transition from reaction-controlled to diffusion-controlled degradation. When applied without geometry-specific recalibration to a six-crown Zn stent, the model predicts approximately 6% mass loss after one month, </w:t>
       </w:r>
-      <w:del w:id="9007" w:author="Claude" w:date="2026-10-08T03:09:32Z">
+      <w:del w:id="9007" w:author="Claude" w:date="2026-10-08T04:28:24Z">
         <w:r>
           <w:delText xml:space="preserve">consistent</w:delText>
         </w:r>
       </w:del>
-      <w:ins w:id="9006" w:author="Claude" w:date="2026-10-08T03:09:32Z">
+      <w:ins w:id="9006" w:author="Claude" w:date="2026-10-08T04:28:24Z">
         <w:r>
           <w:t xml:space="preserve">of</w:t>
         </w:r>
@@ -322,12 +322,12 @@
       <w:r>
         <w:t xml:space="preserve"> </w:t>
       </w:r>
-      <w:del w:id="9005" w:author="Claude" w:date="2026-10-08T03:09:32Z">
+      <w:del w:id="9005" w:author="Claude" w:date="2026-10-08T04:28:24Z">
         <w:r>
           <w:delText xml:space="preserve">in</w:delText>
         </w:r>
       </w:del>
-      <w:ins w:id="9004" w:author="Claude" w:date="2026-10-08T03:09:32Z">
+      <w:ins w:id="9004" w:author="Claude" w:date="2026-10-08T04:28:24Z">
         <w:r>
           <w:t xml:space="preserve">the same order of</w:t>
         </w:r>
@@ -335,12 +335,12 @@
       <w:r>
         <w:t xml:space="preserve"> magnitude </w:t>
       </w:r>
-      <w:del w:id="9003" w:author="Claude" w:date="2026-10-08T03:09:32Z">
+      <w:del w:id="9003" w:author="Claude" w:date="2026-10-08T04:28:24Z">
         <w:r>
           <w:delText xml:space="preserve">with</w:delText>
         </w:r>
       </w:del>
-      <w:ins w:id="9002" w:author="Claude" w:date="2026-10-08T03:09:32Z">
+      <w:ins w:id="9002" w:author="Claude" w:date="2026-10-08T04:28:24Z">
         <w:r>
           <w:t xml:space="preserve">as</w:t>
         </w:r>
@@ -357,7 +357,7 @@
       <w:r>
         <w:t xml:space="preserve"> observations, and captures crown-localized degradation driven by geometry-dependent oxygen transport. By linking implant geometry to degradation rate and spatial morphology, the framework provides a </w:t>
       </w:r>
-      <w:del w:id="9001" w:author="Claude" w:date="2026-10-08T03:09:32Z">
+      <w:del w:id="9001" w:author="Claude" w:date="2026-10-08T04:28:24Z">
         <w:r>
           <w:delText xml:space="preserve">low-dimensional, </w:delText>
         </w:r>
@@ -1285,12 +1285,12 @@
       <w:r>
         <w:t xml:space="preserve">. (a) Reaction–diffusion model coupling species transport and corrosion-</w:t>
       </w:r>
-      <w:del w:id="9010" w:author="Claude" w:date="2026-10-08T03:09:32Z">
+      <w:del w:id="9010" w:author="Claude" w:date="2026-10-08T04:28:24Z">
         <w:r>
           <w:delText xml:space="preserve">film</w:delText>
         </w:r>
       </w:del>
-      <w:ins w:id="9009" w:author="Claude" w:date="2026-10-08T03:09:32Z">
+      <w:ins w:id="9009" w:author="Claude" w:date="2026-10-08T04:28:24Z">
         <w:r>
           <w:t xml:space="preserve">product</w:t>
         </w:r>
@@ -3016,7 +3016,7 @@
         </w:rPr>
         <w:t xml:space="preserve">therefore results from a dynamic balance between ORR-driven passivation and chloride-mediated </w:t>
       </w:r>
-      <w:del w:id="9017" w:author="Claude" w:date="2026-10-08T03:09:32Z">
+      <w:del w:id="9017" w:author="Claude" w:date="2026-10-08T04:28:24Z">
         <w:r>
           <w:rPr>
             <w:rFonts w:cs="Times New Roman"/>
@@ -3024,7 +3024,7 @@
           <w:delText xml:space="preserve">film</w:delText>
         </w:r>
       </w:del>
-      <w:ins w:id="9016" w:author="Claude" w:date="2026-10-08T03:09:32Z">
+      <w:ins w:id="9016" w:author="Claude" w:date="2026-10-08T04:28:24Z">
         <w:r>
           <w:rPr>
             <w:rFonts w:cs="Times New Roman"/>
@@ -3111,7 +3111,7 @@
       </w:r>
       <w:proofErr w:type="spellStart"/>
       <w:proofErr w:type="spellEnd"/>
-      <w:del w:id="9015" w:author="Claude" w:date="2026-10-08T03:09:32Z">
+      <w:del w:id="9015" w:author="Claude" w:date="2026-10-08T04:28:24Z">
         <w:r>
           <w:rPr>
             <w:rFonts w:cs="Times New Roman"/>
@@ -3125,7 +3125,7 @@
         </w:rPr>
         <w:t xml:space="preserve">the corrosion </w:t>
       </w:r>
-      <w:del w:id="9014" w:author="Claude" w:date="2026-10-08T03:09:32Z">
+      <w:del w:id="9014" w:author="Claude" w:date="2026-10-08T04:28:24Z">
         <w:r>
           <w:rPr>
             <w:rFonts w:cs="Times New Roman"/>
@@ -3133,7 +3133,7 @@
           <w:delText xml:space="preserve">film</w:delText>
         </w:r>
       </w:del>
-      <w:ins w:id="9013" w:author="Claude" w:date="2026-10-08T03:09:32Z">
+      <w:ins w:id="9013" w:author="Claude" w:date="2026-10-08T04:28:24Z">
         <w:r>
           <w:rPr>
             <w:rFonts w:cs="Times New Roman"/>
@@ -3147,7 +3147,7 @@
         </w:rPr>
         <w:t xml:space="preserve"> </w:t>
       </w:r>
-      <w:del w:id="9012" w:author="Claude" w:date="2026-10-08T03:09:32Z">
+      <w:del w:id="9012" w:author="Claude" w:date="2026-10-08T04:28:24Z">
         <w:r>
           <w:rPr>
             <w:rFonts w:cs="Times New Roman"/>
@@ -3155,7 +3155,7 @@
           <w:delText xml:space="preserve">is</w:delText>
         </w:r>
       </w:del>
-      <w:ins w:id="9011" w:author="Claude" w:date="2026-10-08T03:09:32Z">
+      <w:ins w:id="9011" w:author="Claude" w:date="2026-10-08T04:28:24Z">
         <w:r>
           <w:rPr>
             <w:rFonts w:cs="Times New Roman"/>
@@ -3324,12 +3324,12 @@
       <w:r>
         <w:t xml:space="preserve">Schematic of the coupled mechanistic framework for Zn biodegradation in physiological media. (a) Electrochemical reactions governing Zn dissolution, oxygen reduction, </w:t>
       </w:r>
-      <w:del w:id="9022" w:author="Claude" w:date="2026-10-08T03:09:32Z">
+      <w:del w:id="9022" w:author="Claude" w:date="2026-10-08T04:28:24Z">
         <w:r>
           <w:delText xml:space="preserve">film</w:delText>
         </w:r>
       </w:del>
-      <w:ins w:id="9021" w:author="Claude" w:date="2026-10-08T03:09:32Z">
+      <w:ins w:id="9021" w:author="Claude" w:date="2026-10-08T04:28:24Z">
         <w:r>
           <w:t xml:space="preserve">corrosion-product</w:t>
         </w:r>
@@ -3337,12 +3337,12 @@
       <w:r>
         <w:t xml:space="preserve"> formation, and chloride-induced </w:t>
       </w:r>
-      <w:del w:id="9020" w:author="Claude" w:date="2026-10-08T03:09:32Z">
+      <w:del w:id="9020" w:author="Claude" w:date="2026-10-08T04:28:24Z">
         <w:r>
           <w:delText xml:space="preserve">film breakdown</w:delText>
         </w:r>
       </w:del>
-      <w:ins w:id="9019" w:author="Claude" w:date="2026-10-08T03:09:32Z">
+      <w:ins w:id="9019" w:author="Claude" w:date="2026-10-08T04:28:24Z">
         <w:r>
           <w:t xml:space="preserve">dissolution</w:t>
         </w:r>
@@ -3356,7 +3356,7 @@
       <w:r>
         <w:t xml:space="preserve">) porous corrosion-product</w:t>
       </w:r>
-      <w:del w:id="9018" w:author="Claude" w:date="2026-10-08T03:09:32Z">
+      <w:del w:id="9018" w:author="Claude" w:date="2026-10-08T04:28:24Z">
         <w:r>
           <w:delText xml:space="preserve"> film</w:delText>
         </w:r>
@@ -4051,7 +4051,7 @@
         </w:rPr>
         <w:t xml:space="preserve">the corrosion-</w:t>
       </w:r>
-      <w:del w:id="9024" w:author="Claude" w:date="2026-10-08T03:09:32Z">
+      <w:del w:id="9024" w:author="Claude" w:date="2026-10-08T04:28:24Z">
         <w:r>
           <w:rPr>
             <w:rFonts w:cs="Times New Roman"/>
@@ -4059,7 +4059,7 @@
           <w:delText xml:space="preserve">film</w:delText>
         </w:r>
       </w:del>
-      <w:ins w:id="9023" w:author="Claude" w:date="2026-10-08T03:09:32Z">
+      <w:ins w:id="9023" w:author="Claude" w:date="2026-10-08T04:28:24Z">
         <w:r>
           <w:rPr>
             <w:rFonts w:cs="Times New Roman"/>
@@ -4572,7 +4572,7 @@
         </w:rPr>
         <w:t xml:space="preserve">Chloride acts as a catalytic species, being regenerated during </w:t>
       </w:r>
-      <w:del w:id="9028" w:author="Claude" w:date="2026-10-08T03:09:32Z">
+      <w:del w:id="9028" w:author="Claude" w:date="2026-10-08T04:28:24Z">
         <w:r>
           <w:rPr>
             <w:rFonts w:cs="Times New Roman"/>
@@ -4580,7 +4580,7 @@
           <w:delText xml:space="preserve">film</w:delText>
         </w:r>
       </w:del>
-      <w:ins w:id="9027" w:author="Claude" w:date="2026-10-08T03:09:32Z">
+      <w:ins w:id="9027" w:author="Claude" w:date="2026-10-08T04:28:24Z">
         <w:r>
           <w:rPr>
             <w:rFonts w:cs="Times New Roman"/>
@@ -4594,7 +4594,7 @@
         </w:rPr>
         <w:t xml:space="preserve"> </w:t>
       </w:r>
-      <w:del w:id="9026" w:author="Claude" w:date="2026-10-08T03:09:32Z">
+      <w:del w:id="9026" w:author="Claude" w:date="2026-10-08T04:28:24Z">
         <w:r>
           <w:rPr>
             <w:rFonts w:cs="Times New Roman"/>
@@ -4602,7 +4602,7 @@
           <w:delText xml:space="preserve">breakdown</w:delText>
         </w:r>
       </w:del>
-      <w:ins w:id="9025" w:author="Claude" w:date="2026-10-08T03:09:32Z">
+      <w:ins w:id="9025" w:author="Claude" w:date="2026-10-08T04:28:24Z">
         <w:r>
           <w:rPr>
             <w:rFonts w:cs="Times New Roman"/>
@@ -5045,7 +5045,7 @@
         </w:rPr>
         <w:t xml:space="preserve">generating OH⁻ ions that increase the local alkalinity and promote formation of </w:t>
       </w:r>
-      <w:del w:id="9034" w:author="Claude" w:date="2026-10-08T03:09:32Z">
+      <w:del w:id="9034" w:author="Claude" w:date="2026-10-08T04:28:24Z">
         <w:r>
           <w:rPr>
             <w:rFonts w:cs="Times New Roman"/>
@@ -5059,7 +5059,7 @@
         </w:rPr>
         <w:t xml:space="preserve">ZnO-based corrosion</w:t>
       </w:r>
-      <w:del w:id="9033" w:author="Claude" w:date="2026-10-08T03:09:32Z">
+      <w:del w:id="9033" w:author="Claude" w:date="2026-10-08T04:28:24Z">
         <w:r>
           <w:rPr>
             <w:rFonts w:cs="Times New Roman"/>
@@ -5073,7 +5073,7 @@
         </w:rPr>
         <w:t xml:space="preserve"> </w:t>
       </w:r>
-      <w:del w:id="9032" w:author="Claude" w:date="2026-10-08T03:09:32Z">
+      <w:del w:id="9032" w:author="Claude" w:date="2026-10-08T04:28:24Z">
         <w:r>
           <w:rPr>
             <w:rFonts w:cs="Times New Roman"/>
@@ -5081,7 +5081,7 @@
           <w:delText xml:space="preserve">film</w:delText>
         </w:r>
       </w:del>
-      <w:ins w:id="9031" w:author="Claude" w:date="2026-10-08T03:09:32Z">
+      <w:ins w:id="9031" w:author="Claude" w:date="2026-10-08T04:28:24Z">
         <w:r>
           <w:rPr>
             <w:rFonts w:cs="Times New Roman"/>
@@ -5115,7 +5115,7 @@
         </w:rPr>
         <w:t xml:space="preserve"> At the same time, chloride-induced </w:t>
       </w:r>
-      <w:del w:id="9030" w:author="Claude" w:date="2026-10-08T03:09:32Z">
+      <w:del w:id="9030" w:author="Claude" w:date="2026-10-08T04:28:24Z">
         <w:r>
           <w:rPr>
             <w:rFonts w:cs="Times New Roman"/>
@@ -5123,7 +5123,7 @@
           <w:delText xml:space="preserve">film</w:delText>
         </w:r>
       </w:del>
-      <w:ins w:id="9029" w:author="Claude" w:date="2026-10-08T03:09:32Z">
+      <w:ins w:id="9029" w:author="Claude" w:date="2026-10-08T04:28:24Z">
         <w:r>
           <w:rPr>
             <w:rFonts w:cs="Times New Roman"/>
@@ -5972,12 +5972,12 @@
       <w:r>
         <w:t xml:space="preserve">Here, the corrosion-product </w:t>
       </w:r>
-      <w:del w:id="9036" w:author="Claude" w:date="2026-10-08T03:09:32Z">
+      <w:del w:id="9036" w:author="Claude" w:date="2026-10-08T04:28:24Z">
         <w:r>
           <w:delText xml:space="preserve">film</w:delText>
         </w:r>
       </w:del>
-      <w:ins w:id="9035" w:author="Claude" w:date="2026-10-08T03:09:32Z">
+      <w:ins w:id="9035" w:author="Claude" w:date="2026-10-08T04:28:24Z">
         <w:r>
           <w:t xml:space="preserve">field</w:t>
         </w:r>
@@ -6355,7 +6355,7 @@
           <w:rFonts w:cs="Times New Roman"/>
         </w:rPr>
       </w:pPr>
-      <w:ins w:id="9049" w:author="Claude" w:date="2026-10-08T03:09:32Z">
+      <w:ins w:id="9049" w:author="Claude" w:date="2026-10-08T04:28:24Z">
         <w:r>
           <w:t xml:space="preserve">The corrosion-product field is a homogenized, volumetric concentration field: it is not confined to the metal surface, and it reduces the local diffusivity as described below. </w:t>
         </w:r>
@@ -6435,7 +6435,7 @@
       <w:r>
         <w:t xml:space="preserve"> the rates of corrosion-product </w:t>
       </w:r>
-      <w:del w:id="9048" w:author="Claude" w:date="2026-10-08T03:09:32Z">
+      <w:del w:id="9048" w:author="Claude" w:date="2026-10-08T04:28:24Z">
         <w:r>
           <w:delText xml:space="preserve">film </w:delText>
         </w:r>
@@ -6443,7 +6443,7 @@
       <w:r>
         <w:t xml:space="preserve">formation and chloride-mediated</w:t>
       </w:r>
-      <w:del w:id="9047" w:author="Claude" w:date="2026-10-08T03:09:32Z">
+      <w:del w:id="9047" w:author="Claude" w:date="2026-10-08T04:28:24Z">
         <w:r>
           <w:delText xml:space="preserve"> film</w:delText>
         </w:r>
@@ -6541,7 +6541,7 @@
         </w:rPr>
         <w:t xml:space="preserve">, which suppresses further growth as the </w:t>
       </w:r>
-      <w:del w:id="9046" w:author="Claude" w:date="2026-10-08T03:09:32Z">
+      <w:del w:id="9046" w:author="Claude" w:date="2026-10-08T04:28:24Z">
         <w:r>
           <w:rPr>
             <w:rFonts w:cs="Times New Roman"/>
@@ -6549,7 +6549,7 @@
           <w:delText xml:space="preserve">film</w:delText>
         </w:r>
       </w:del>
-      <w:ins w:id="9045" w:author="Claude" w:date="2026-10-08T03:09:32Z">
+      <w:ins w:id="9045" w:author="Claude" w:date="2026-10-08T04:28:24Z">
         <w:r>
           <w:rPr>
             <w:rFonts w:cs="Times New Roman"/>
@@ -6752,12 +6752,12 @@
       <w:r>
         <w:t xml:space="preserve">As the </w:t>
       </w:r>
-      <w:del w:id="9044" w:author="Claude" w:date="2026-10-08T03:09:32Z">
+      <w:del w:id="9044" w:author="Claude" w:date="2026-10-08T04:28:24Z">
         <w:r>
           <w:delText xml:space="preserve">film</w:delText>
         </w:r>
       </w:del>
-      <w:ins w:id="9043" w:author="Claude" w:date="2026-10-08T03:09:32Z">
+      <w:ins w:id="9043" w:author="Claude" w:date="2026-10-08T04:28:24Z">
         <w:r>
           <w:t xml:space="preserve">corrosion</w:t>
         </w:r>
@@ -6765,12 +6765,12 @@
       <w:r>
         <w:t xml:space="preserve"> </w:t>
       </w:r>
-      <w:del w:id="9042" w:author="Claude" w:date="2026-10-08T03:09:32Z">
+      <w:del w:id="9042" w:author="Claude" w:date="2026-10-08T04:28:24Z">
         <w:r>
           <w:delText xml:space="preserve">accumulates</w:delText>
         </w:r>
       </w:del>
-      <w:ins w:id="9041" w:author="Claude" w:date="2026-10-08T03:09:32Z">
+      <w:ins w:id="9041" w:author="Claude" w:date="2026-10-08T04:28:24Z">
         <w:r>
           <w:t xml:space="preserve">products accumulate</w:t>
         </w:r>
@@ -6778,12 +6778,12 @@
       <w:r>
         <w:t xml:space="preserve">, </w:t>
       </w:r>
-      <w:del w:id="9040" w:author="Claude" w:date="2026-10-08T03:09:32Z">
+      <w:del w:id="9040" w:author="Claude" w:date="2026-10-08T04:28:24Z">
         <w:r>
           <w:delText xml:space="preserve">it</w:delText>
         </w:r>
       </w:del>
-      <w:ins w:id="9039" w:author="Claude" w:date="2026-10-08T03:09:32Z">
+      <w:ins w:id="9039" w:author="Claude" w:date="2026-10-08T04:28:24Z">
         <w:r>
           <w:t xml:space="preserve">they</w:t>
         </w:r>
@@ -6791,12 +6791,12 @@
       <w:r>
         <w:t xml:space="preserve"> </w:t>
       </w:r>
-      <w:del w:id="9038" w:author="Claude" w:date="2026-10-08T03:09:32Z">
+      <w:del w:id="9038" w:author="Claude" w:date="2026-10-08T04:28:24Z">
         <w:r>
           <w:delText xml:space="preserve">impedes</w:delText>
         </w:r>
       </w:del>
-      <w:ins w:id="9037" w:author="Claude" w:date="2026-10-08T03:09:32Z">
+      <w:ins w:id="9037" w:author="Claude" w:date="2026-10-08T04:28:24Z">
         <w:r>
           <w:t xml:space="preserve">impede</w:t>
         </w:r>
@@ -7168,12 +7168,12 @@
       <w:r>
         <w:t xml:space="preserve">​ is the free-solution diffusivity, and the transport reduction depends on the </w:t>
       </w:r>
-      <w:del w:id="9051" w:author="Claude" w:date="2026-10-08T03:09:32Z">
+      <w:del w:id="9051" w:author="Claude" w:date="2026-10-08T04:28:24Z">
         <w:r>
           <w:delText xml:space="preserve">film</w:delText>
         </w:r>
       </w:del>
-      <w:ins w:id="9050" w:author="Claude" w:date="2026-10-08T03:09:32Z">
+      <w:ins w:id="9050" w:author="Claude" w:date="2026-10-08T04:28:24Z">
         <w:r>
           <w:t xml:space="preserve">corrosion-product region</w:t>
         </w:r>
@@ -9134,12 +9134,12 @@
       <w:r>
         <w:t xml:space="preserve">Parametrically generated implant geometries were discretized into tetrahedral meshes and embedded within </w:t>
       </w:r>
-      <w:del w:id="9060" w:author="Claude" w:date="2026-10-08T03:09:32Z">
+      <w:del w:id="9060" w:author="Claude" w:date="2026-10-08T04:28:24Z">
         <w:r>
           <w:delText xml:space="preserve">an</w:delText>
         </w:r>
       </w:del>
-      <w:ins w:id="9059" w:author="Claude" w:date="2026-10-08T03:09:32Z">
+      <w:ins w:id="9059" w:author="Claude" w:date="2026-10-08T04:28:24Z">
         <w:r>
           <w:t xml:space="preserve">a 30 × 30 × 30 mm</w:t>
         </w:r>
@@ -9147,7 +9147,7 @@
       <w:r>
         <w:t xml:space="preserve"> electrolyte domain</w:t>
       </w:r>
-      <w:ins w:id="9058" w:author="Claude" w:date="2026-10-08T03:09:32Z">
+      <w:ins w:id="9058" w:author="Claude" w:date="2026-10-08T04:28:24Z">
         <w:r>
           <w:t xml:space="preserve">,</w:t>
         </w:r>
@@ -9155,12 +9155,12 @@
       <w:r>
         <w:t xml:space="preserve"> </w:t>
       </w:r>
-      <w:del w:id="9057" w:author="Claude" w:date="2026-10-08T03:09:32Z">
+      <w:del w:id="9057" w:author="Claude" w:date="2026-10-08T04:28:24Z">
         <w:r>
           <w:delText xml:space="preserve">at</w:delText>
         </w:r>
       </w:del>
-      <w:ins w:id="9056" w:author="Claude" w:date="2026-10-08T03:09:32Z">
+      <w:ins w:id="9056" w:author="Claude" w:date="2026-10-08T04:28:24Z">
         <w:r>
           <w:t xml:space="preserve">identical</w:t>
         </w:r>
@@ -9168,12 +9168,12 @@
       <w:r>
         <w:t xml:space="preserve"> </w:t>
       </w:r>
-      <w:del w:id="9055" w:author="Claude" w:date="2026-10-08T03:09:32Z">
+      <w:del w:id="9055" w:author="Claude" w:date="2026-10-08T04:28:24Z">
         <w:r>
           <w:delText xml:space="preserve">least</w:delText>
         </w:r>
       </w:del>
-      <w:ins w:id="9054" w:author="Claude" w:date="2026-10-08T03:09:32Z">
+      <w:ins w:id="9054" w:author="Claude" w:date="2026-10-08T04:28:24Z">
         <w:r>
           <w:t xml:space="preserve">for the disc and the stent and larger than</w:t>
         </w:r>
@@ -9181,7 +9181,7 @@
       <w:r>
         <w:t xml:space="preserve"> three times</w:t>
       </w:r>
-      <w:del w:id="9053" w:author="Claude" w:date="2026-10-08T03:09:32Z">
+      <w:del w:id="9053" w:author="Claude" w:date="2026-10-08T04:28:24Z">
         <w:r>
           <w:delText xml:space="preserve"> larger than</w:delText>
         </w:r>
@@ -9189,7 +9189,7 @@
       <w:r>
         <w:t xml:space="preserve"> the implant characteristic dimension in each direction</w:t>
       </w:r>
-      <w:ins w:id="9052" w:author="Claude" w:date="2026-10-08T03:09:32Z">
+      <w:ins w:id="9052" w:author="Claude" w:date="2026-10-08T04:28:24Z">
         <w:r>
           <w:t xml:space="preserve">,</w:t>
         </w:r>
@@ -9227,7 +9227,7 @@
       <w:r>
         <w:t xml:space="preserve">Physiological initial and boundary conditions were imposed throughout the electrolyte domain, including continuous oxygen replenishment at the electrolyte-air interface and kinetic flux conditions at the moving metal-electrolyte boundary</w:t>
       </w:r>
-      <w:ins w:id="9064" w:author="Claude" w:date="2026-10-08T03:09:32Z">
+      <w:ins w:id="9064" w:author="Claude" w:date="2026-10-08T04:28:24Z">
         <w:r>
           <w:t xml:space="preserve">. The 48 h medium renewal used in the immersion tests was not modeled explicitly; instead, dissolved oxygen was assumed to be continuously replenished at the electrolyte–air interface, no natural convection was considered (static conditions), and Zn²⁺ accumulation was not reset</w:t>
         </w:r>
@@ -9275,12 +9275,12 @@
       <w:r>
         <w:t xml:space="preserve">normalized </w:t>
       </w:r>
-      <w:del w:id="9063" w:author="Claude" w:date="2026-10-08T03:09:32Z">
+      <w:del w:id="9063" w:author="Claude" w:date="2026-10-08T04:28:24Z">
         <w:r>
           <w:delText xml:space="preserve">film</w:delText>
         </w:r>
       </w:del>
-      <w:ins w:id="9062" w:author="Claude" w:date="2026-10-08T03:09:32Z">
+      <w:ins w:id="9062" w:author="Claude" w:date="2026-10-08T04:28:24Z">
         <w:r>
           <w:t xml:space="preserve">corrosion-product</w:t>
         </w:r>
@@ -9312,7 +9312,7 @@
       <w:r>
         <w:t xml:space="preserve">), while spatial distributions of oxygen concentration and corrosion-product </w:t>
       </w:r>
-      <w:del w:id="9061" w:author="Claude" w:date="2026-10-08T03:09:32Z">
+      <w:del w:id="9061" w:author="Claude" w:date="2026-10-08T04:28:24Z">
         <w:r>
           <w:delText xml:space="preserve">film </w:delText>
         </w:r>
@@ -13481,12 +13481,12 @@
       <w:r>
         <w:t xml:space="preserve">. Each parameter was varied across representative values while the remaining parameters were held constant. The resulting changes in mass loss, corrosion-</w:t>
       </w:r>
-      <w:del w:id="9070" w:author="Claude" w:date="2026-10-08T03:09:32Z">
+      <w:del w:id="9070" w:author="Claude" w:date="2026-10-08T04:28:24Z">
         <w:r>
           <w:delText xml:space="preserve">film</w:delText>
         </w:r>
       </w:del>
-      <w:ins w:id="9069" w:author="Claude" w:date="2026-10-08T03:09:32Z">
+      <w:ins w:id="9069" w:author="Claude" w:date="2026-10-08T04:28:24Z">
         <w:r>
           <w:t xml:space="preserve">product</w:t>
         </w:r>
@@ -13494,12 +13494,12 @@
       <w:r>
         <w:t xml:space="preserve"> </w:t>
       </w:r>
-      <w:del w:id="9068" w:author="Claude" w:date="2026-10-08T03:09:32Z">
+      <w:del w:id="9068" w:author="Claude" w:date="2026-10-08T04:28:24Z">
         <w:r>
           <w:delText xml:space="preserve">coverage</w:delText>
         </w:r>
       </w:del>
-      <w:ins w:id="9067" w:author="Claude" w:date="2026-10-08T03:09:32Z">
+      <w:ins w:id="9067" w:author="Claude" w:date="2026-10-08T04:28:24Z">
         <w:r>
           <w:t xml:space="preserve">saturation (F/Fₘₐₓ)</w:t>
         </w:r>
@@ -13518,12 +13518,12 @@
       <w:r>
         <w:t xml:space="preserve"> the roles of passivation, </w:t>
       </w:r>
-      <w:del w:id="9066" w:author="Claude" w:date="2026-10-08T03:09:32Z">
+      <w:del w:id="9066" w:author="Claude" w:date="2026-10-08T04:28:24Z">
         <w:r>
           <w:delText xml:space="preserve">film</w:delText>
         </w:r>
       </w:del>
-      <w:ins w:id="9065" w:author="Claude" w:date="2026-10-08T03:09:32Z">
+      <w:ins w:id="9065" w:author="Claude" w:date="2026-10-08T04:28:24Z">
         <w:r>
           <w:t xml:space="preserve">corrosion-product</w:t>
         </w:r>
@@ -14027,7 +14027,7 @@
         </w:rPr>
         <w:t xml:space="preserve">effective </w:t>
       </w:r>
-      <w:del w:id="9076" w:author="Claude" w:date="2026-10-08T03:09:32Z">
+      <w:del w:id="9076" w:author="Claude" w:date="2026-10-08T04:28:24Z">
         <w:r>
           <w:rPr>
             <w:rFonts w:cs="Times New Roman"/>
@@ -14035,7 +14035,7 @@
           <w:delText xml:space="preserve">film</w:delText>
         </w:r>
       </w:del>
-      <w:ins w:id="9075" w:author="Claude" w:date="2026-10-08T03:09:32Z">
+      <w:ins w:id="9075" w:author="Claude" w:date="2026-10-08T04:28:24Z">
         <w:r>
           <w:rPr>
             <w:rFonts w:cs="Times New Roman"/>
@@ -14049,7 +14049,7 @@
         </w:rPr>
         <w:t xml:space="preserve">-</w:t>
       </w:r>
-      <w:ins w:id="9074" w:author="Claude" w:date="2026-10-08T03:09:32Z">
+      <w:ins w:id="9074" w:author="Claude" w:date="2026-10-08T04:28:24Z">
         <w:r>
           <w:rPr>
             <w:rFonts w:cs="Times New Roman"/>
@@ -14178,7 +14178,7 @@
         </w:rPr>
         <w:t xml:space="preserve">effective </w:t>
       </w:r>
-      <w:del w:id="9073" w:author="Claude" w:date="2026-10-08T03:09:32Z">
+      <w:del w:id="9073" w:author="Claude" w:date="2026-10-08T04:28:24Z">
         <w:r>
           <w:rPr>
             <w:rFonts w:cs="Times New Roman"/>
@@ -14186,7 +14186,7 @@
           <w:delText xml:space="preserve">film</w:delText>
         </w:r>
       </w:del>
-      <w:ins w:id="9072" w:author="Claude" w:date="2026-10-08T03:09:32Z">
+      <w:ins w:id="9072" w:author="Claude" w:date="2026-10-08T04:28:24Z">
         <w:r>
           <w:rPr>
             <w:rFonts w:cs="Times New Roman"/>
@@ -14200,7 +14200,7 @@
         </w:rPr>
         <w:t xml:space="preserve">-</w:t>
       </w:r>
-      <w:ins w:id="9071" w:author="Claude" w:date="2026-10-08T03:09:32Z">
+      <w:ins w:id="9071" w:author="Claude" w:date="2026-10-08T04:28:24Z">
         <w:r>
           <w:rPr>
             <w:rFonts w:cs="Times New Roman"/>
@@ -14910,7 +14910,7 @@
       <w:r>
         <w:t xml:space="preserve">2% against the calibration dataset. These results show that the proposed three-parameter framework can closely reproduce the calibration measurements. The combination of low calibration error and rapid convergence supports the framework’s potential as a </w:t>
       </w:r>
-      <w:del w:id="9078" w:author="Claude" w:date="2026-10-08T03:09:32Z">
+      <w:del w:id="9078" w:author="Claude" w:date="2026-10-08T04:28:24Z">
         <w:r>
           <w:delText xml:space="preserve">computationally tractable </w:delText>
         </w:r>
@@ -14918,7 +14918,7 @@
       <w:r>
         <w:t xml:space="preserve">basis for predictive Zn biodegradation modeling, subject to independent validation.</w:t>
       </w:r>
-      <w:ins w:id="9077" w:author="Claude" w:date="2026-10-08T03:09:32Z">
+      <w:ins w:id="9077" w:author="Claude" w:date="2026-10-08T04:28:24Z">
         <w:r>
           <w:t xml:space="preserve"> Calibration remained computationally tractable because only three parameters were calibrated on a coarse mesh, at about 2 h per 3D simulation (Table S4 in the Supplementary Information).</w:t>
         </w:r>
@@ -16586,12 +16586,12 @@
       <w:r>
         <w:t xml:space="preserve">The associated </w:t>
       </w:r>
-      <w:del w:id="9111" w:author="Claude" w:date="2026-10-08T03:09:32Z">
+      <w:del w:id="9111" w:author="Claude" w:date="2026-10-08T04:28:24Z">
         <w:r>
           <w:delText xml:space="preserve">film</w:delText>
         </w:r>
       </w:del>
-      <w:ins w:id="9110" w:author="Claude" w:date="2026-10-08T03:09:32Z">
+      <w:ins w:id="9110" w:author="Claude" w:date="2026-10-08T04:28:24Z">
         <w:r>
           <w:t xml:space="preserve">corrosion</w:t>
         </w:r>
@@ -16599,12 +16599,12 @@
       <w:r>
         <w:t xml:space="preserve">-</w:t>
       </w:r>
-      <w:del w:id="9109" w:author="Claude" w:date="2026-10-08T03:09:32Z">
+      <w:del w:id="9109" w:author="Claude" w:date="2026-10-08T04:28:24Z">
         <w:r>
           <w:delText xml:space="preserve">coverage</w:delText>
         </w:r>
       </w:del>
-      <w:ins w:id="9108" w:author="Claude" w:date="2026-10-08T03:09:32Z">
+      <w:ins w:id="9108" w:author="Claude" w:date="2026-10-08T04:28:24Z">
         <w:r>
           <w:t xml:space="preserve">product saturation</w:t>
         </w:r>
@@ -16729,12 +16729,12 @@
       <w:r>
         <w:t xml:space="preserve"> into corrosion products through the </w:t>
       </w:r>
-      <w:del w:id="9107" w:author="Claude" w:date="2026-10-08T03:09:32Z">
+      <w:del w:id="9107" w:author="Claude" w:date="2026-10-08T04:28:24Z">
         <w:r>
           <w:delText xml:space="preserve">film</w:delText>
         </w:r>
       </w:del>
-      <w:ins w:id="9106" w:author="Claude" w:date="2026-10-08T03:09:32Z">
+      <w:ins w:id="9106" w:author="Claude" w:date="2026-10-08T04:28:24Z">
         <w:r>
           <w:t xml:space="preserve">corrosion</w:t>
         </w:r>
@@ -16742,7 +16742,7 @@
       <w:r>
         <w:t xml:space="preserve">-</w:t>
       </w:r>
-      <w:ins w:id="9105" w:author="Claude" w:date="2026-10-08T03:09:32Z">
+      <w:ins w:id="9105" w:author="Claude" w:date="2026-10-08T04:28:24Z">
         <w:r>
           <w:t xml:space="preserve">product </w:t>
         </w:r>
@@ -16750,12 +16750,12 @@
       <w:r>
         <w:t xml:space="preserve">growth term, resulting in faster </w:t>
       </w:r>
-      <w:del w:id="9104" w:author="Claude" w:date="2026-10-08T03:09:32Z">
+      <w:del w:id="9104" w:author="Claude" w:date="2026-10-08T04:28:24Z">
         <w:r>
           <w:delText xml:space="preserve">film</w:delText>
         </w:r>
       </w:del>
-      <w:ins w:id="9103" w:author="Claude" w:date="2026-10-08T03:09:32Z">
+      <w:ins w:id="9103" w:author="Claude" w:date="2026-10-08T04:28:24Z">
         <w:r>
           <w:t xml:space="preserve">corrosion-product</w:t>
         </w:r>
@@ -16763,12 +16763,12 @@
       <w:r>
         <w:t xml:space="preserve"> accumulation and greater </w:t>
       </w:r>
-      <w:del w:id="9102" w:author="Claude" w:date="2026-10-08T03:09:32Z">
+      <w:del w:id="9102" w:author="Claude" w:date="2026-10-08T04:28:24Z">
         <w:r>
           <w:delText xml:space="preserve">surface</w:delText>
         </w:r>
       </w:del>
-      <w:ins w:id="9101" w:author="Claude" w:date="2026-10-08T03:09:32Z">
+      <w:ins w:id="9101" w:author="Claude" w:date="2026-10-08T04:28:24Z">
         <w:r>
           <w:t xml:space="preserve">corrosion-product</w:t>
         </w:r>
@@ -16776,12 +16776,12 @@
       <w:r>
         <w:t xml:space="preserve"> </w:t>
       </w:r>
-      <w:del w:id="9100" w:author="Claude" w:date="2026-10-08T03:09:32Z">
+      <w:del w:id="9100" w:author="Claude" w:date="2026-10-08T04:28:24Z">
         <w:r>
           <w:delText xml:space="preserve">coverage</w:delText>
         </w:r>
       </w:del>
-      <w:ins w:id="9099" w:author="Claude" w:date="2026-10-08T03:09:32Z">
+      <w:ins w:id="9099" w:author="Claude" w:date="2026-10-08T04:28:24Z">
         <w:r>
           <w:t xml:space="preserve">saturation</w:t>
         </w:r>
@@ -16901,12 +16901,12 @@
       <w:r>
         <w:t xml:space="preserve">enhanced the </w:t>
       </w:r>
-      <w:del w:id="9098" w:author="Claude" w:date="2026-10-08T03:09:32Z">
+      <w:del w:id="9098" w:author="Claude" w:date="2026-10-08T04:28:24Z">
         <w:r>
           <w:delText xml:space="preserve">film</w:delText>
         </w:r>
       </w:del>
-      <w:ins w:id="9097" w:author="Claude" w:date="2026-10-08T03:09:32Z">
+      <w:ins w:id="9097" w:author="Claude" w:date="2026-10-08T04:28:24Z">
         <w:r>
           <w:t xml:space="preserve">corrosion-product</w:t>
         </w:r>
@@ -16914,12 +16914,12 @@
       <w:r>
         <w:t xml:space="preserve"> dissolution term, reducing </w:t>
       </w:r>
-      <w:del w:id="9096" w:author="Claude" w:date="2026-10-08T03:09:32Z">
+      <w:del w:id="9096" w:author="Claude" w:date="2026-10-08T04:28:24Z">
         <w:r>
           <w:delText xml:space="preserve">film</w:delText>
         </w:r>
       </w:del>
-      <w:ins w:id="9095" w:author="Claude" w:date="2026-10-08T03:09:32Z">
+      <w:ins w:id="9095" w:author="Claude" w:date="2026-10-08T04:28:24Z">
         <w:r>
           <w:t xml:space="preserve">corrosion-product</w:t>
         </w:r>
@@ -16927,12 +16927,12 @@
       <w:r>
         <w:t xml:space="preserve"> retention and leading to lower </w:t>
       </w:r>
-      <w:del w:id="9094" w:author="Claude" w:date="2026-10-08T03:09:32Z">
+      <w:del w:id="9094" w:author="Claude" w:date="2026-10-08T04:28:24Z">
         <w:r>
           <w:delText xml:space="preserve">surface</w:delText>
         </w:r>
       </w:del>
-      <w:ins w:id="9093" w:author="Claude" w:date="2026-10-08T03:09:32Z">
+      <w:ins w:id="9093" w:author="Claude" w:date="2026-10-08T04:28:24Z">
         <w:r>
           <w:t xml:space="preserve">corrosion-product</w:t>
         </w:r>
@@ -16940,12 +16940,12 @@
       <w:r>
         <w:t xml:space="preserve"> </w:t>
       </w:r>
-      <w:del w:id="9092" w:author="Claude" w:date="2026-10-08T03:09:32Z">
+      <w:del w:id="9092" w:author="Claude" w:date="2026-10-08T04:28:24Z">
         <w:r>
           <w:delText xml:space="preserve">coverage</w:delText>
         </w:r>
       </w:del>
-      <w:ins w:id="9091" w:author="Claude" w:date="2026-10-08T03:09:32Z">
+      <w:ins w:id="9091" w:author="Claude" w:date="2026-10-08T04:28:24Z">
         <w:r>
           <w:t xml:space="preserve">saturation</w:t>
         </w:r>
@@ -17072,12 +17072,12 @@
       <w:r>
         <w:t xml:space="preserve">however, caused only modest changes in </w:t>
       </w:r>
-      <w:del w:id="9090" w:author="Claude" w:date="2026-10-08T03:09:32Z">
+      <w:del w:id="9090" w:author="Claude" w:date="2026-10-08T04:28:24Z">
         <w:r>
           <w:delText xml:space="preserve">film</w:delText>
         </w:r>
       </w:del>
-      <w:ins w:id="9089" w:author="Claude" w:date="2026-10-08T03:09:32Z">
+      <w:ins w:id="9089" w:author="Claude" w:date="2026-10-08T04:28:24Z">
         <w:r>
           <w:t xml:space="preserve">corrosion-product</w:t>
         </w:r>
@@ -17085,12 +17085,12 @@
       <w:r>
         <w:t xml:space="preserve"> </w:t>
       </w:r>
-      <w:del w:id="9088" w:author="Claude" w:date="2026-10-08T03:09:32Z">
+      <w:del w:id="9088" w:author="Claude" w:date="2026-10-08T04:28:24Z">
         <w:r>
           <w:delText xml:space="preserve">coverage</w:delText>
         </w:r>
       </w:del>
-      <w:ins w:id="9087" w:author="Claude" w:date="2026-10-08T03:09:32Z">
+      <w:ins w:id="9087" w:author="Claude" w:date="2026-10-08T04:28:24Z">
         <w:r>
           <w:t xml:space="preserve">saturation</w:t>
         </w:r>
@@ -17167,12 +17167,12 @@
       <w:r>
         <w:t xml:space="preserve">because oxygen reduction influences </w:t>
       </w:r>
-      <w:del w:id="9086" w:author="Claude" w:date="2026-10-08T03:09:32Z">
+      <w:del w:id="9086" w:author="Claude" w:date="2026-10-08T04:28:24Z">
         <w:r>
           <w:delText xml:space="preserve">film</w:delText>
         </w:r>
       </w:del>
-      <w:ins w:id="9085" w:author="Claude" w:date="2026-10-08T03:09:32Z">
+      <w:ins w:id="9085" w:author="Claude" w:date="2026-10-08T04:28:24Z">
         <w:r>
           <w:t xml:space="preserve">corrosion-product</w:t>
         </w:r>
@@ -17273,12 +17273,12 @@
       <w:r>
         <w:t xml:space="preserve">​ act directly on the competing processes of </w:t>
       </w:r>
-      <w:del w:id="9084" w:author="Claude" w:date="2026-10-08T03:09:32Z">
+      <w:del w:id="9084" w:author="Claude" w:date="2026-10-08T04:28:24Z">
         <w:r>
           <w:delText xml:space="preserve">film</w:delText>
         </w:r>
       </w:del>
-      <w:ins w:id="9083" w:author="Claude" w:date="2026-10-08T03:09:32Z">
+      <w:ins w:id="9083" w:author="Claude" w:date="2026-10-08T04:28:24Z">
         <w:r>
           <w:t xml:space="preserve">corrosion-product</w:t>
         </w:r>
@@ -17286,12 +17286,12 @@
       <w:r>
         <w:t xml:space="preserve"> formation and dissolution, making </w:t>
       </w:r>
-      <w:del w:id="9082" w:author="Claude" w:date="2026-10-08T03:09:32Z">
+      <w:del w:id="9082" w:author="Claude" w:date="2026-10-08T04:28:24Z">
         <w:r>
           <w:delText xml:space="preserve">film</w:delText>
         </w:r>
       </w:del>
-      <w:ins w:id="9081" w:author="Claude" w:date="2026-10-08T03:09:32Z">
+      <w:ins w:id="9081" w:author="Claude" w:date="2026-10-08T04:28:24Z">
         <w:r>
           <w:t xml:space="preserve">corrosion-product</w:t>
         </w:r>
@@ -17299,12 +17299,12 @@
       <w:r>
         <w:t xml:space="preserve"> </w:t>
       </w:r>
-      <w:del w:id="9080" w:author="Claude" w:date="2026-10-08T03:09:32Z">
+      <w:del w:id="9080" w:author="Claude" w:date="2026-10-08T04:28:24Z">
         <w:r>
           <w:delText xml:space="preserve">coverage</w:delText>
         </w:r>
       </w:del>
-      <w:ins w:id="9079" w:author="Claude" w:date="2026-10-08T03:09:32Z">
+      <w:ins w:id="9079" w:author="Claude" w:date="2026-10-08T04:28:24Z">
         <w:r>
           <w:t xml:space="preserve">saturation</w:t>
         </w:r>
@@ -17396,7 +17396,7 @@
         </w:rPr>
         <w:fldChar w:fldCharType="separate"/>
       </w:r>
-      <w:del w:id="9124" w:author="Claude" w:date="2026-10-08T03:09:32Z">
+      <w:del w:id="9124" w:author="Claude" w:date="2026-10-08T04:28:24Z">
         <w:r>
           <w:rPr>
             <w:b/>
@@ -17445,7 +17445,7 @@
         <w:t>i</w:t>
       </w:r>
       <w:proofErr w:type="spellEnd"/>
-      <w:del w:id="9123" w:author="Claude" w:date="2026-10-08T03:09:32Z">
+      <w:del w:id="9123" w:author="Claude" w:date="2026-10-08T04:28:24Z">
         <w:r>
           <w:rPr>
             <w:rFonts w:cs="Times New Roman"/>
@@ -17465,7 +17465,7 @@
         </w:rPr>
         <w:t xml:space="preserve">Conditions that promoted greater </w:t>
       </w:r>
-      <w:del w:id="9122" w:author="Claude" w:date="2026-10-08T03:09:32Z">
+      <w:del w:id="9122" w:author="Claude" w:date="2026-10-08T04:28:24Z">
         <w:r>
           <w:rPr>
             <w:rFonts w:cs="Times New Roman"/>
@@ -17473,7 +17473,7 @@
           <w:delText xml:space="preserve">film</w:delText>
         </w:r>
       </w:del>
-      <w:ins w:id="9121" w:author="Claude" w:date="2026-10-08T03:09:32Z">
+      <w:ins w:id="9121" w:author="Claude" w:date="2026-10-08T04:28:24Z">
         <w:r>
           <w:rPr>
             <w:rFonts w:cs="Times New Roman"/>
@@ -17487,7 +17487,7 @@
         </w:rPr>
         <w:t xml:space="preserve"> </w:t>
       </w:r>
-      <w:del w:id="9120" w:author="Claude" w:date="2026-10-08T03:09:32Z">
+      <w:del w:id="9120" w:author="Claude" w:date="2026-10-08T04:28:24Z">
         <w:r>
           <w:rPr>
             <w:rFonts w:cs="Times New Roman"/>
@@ -17495,7 +17495,7 @@
           <w:delText xml:space="preserve">coverage</w:delText>
         </w:r>
       </w:del>
-      <w:ins w:id="9119" w:author="Claude" w:date="2026-10-08T03:09:32Z">
+      <w:ins w:id="9119" w:author="Claude" w:date="2026-10-08T04:28:24Z">
         <w:r>
           <w:rPr>
             <w:rFonts w:cs="Times New Roman"/>
@@ -17587,7 +17587,7 @@
         </w:rPr>
         <w:t xml:space="preserve">produced lower interfacial oxygen concentrations because the accumulated corrosion</w:t>
       </w:r>
-      <w:del w:id="9118" w:author="Claude" w:date="2026-10-08T03:09:32Z">
+      <w:del w:id="9118" w:author="Claude" w:date="2026-10-08T04:28:24Z">
         <w:r>
           <w:rPr>
             <w:rFonts w:cs="Times New Roman"/>
@@ -17601,7 +17601,7 @@
         </w:rPr>
         <w:t xml:space="preserve"> </w:t>
       </w:r>
-      <w:del w:id="9117" w:author="Claude" w:date="2026-10-08T03:09:32Z">
+      <w:del w:id="9117" w:author="Claude" w:date="2026-10-08T04:28:24Z">
         <w:r>
           <w:rPr>
             <w:rFonts w:cs="Times New Roman"/>
@@ -17609,7 +17609,7 @@
           <w:delText xml:space="preserve">layer</w:delText>
         </w:r>
       </w:del>
-      <w:ins w:id="9116" w:author="Claude" w:date="2026-10-08T03:09:32Z">
+      <w:ins w:id="9116" w:author="Claude" w:date="2026-10-08T04:28:24Z">
         <w:r>
           <w:rPr>
             <w:rFonts w:cs="Times New Roman"/>
@@ -17740,7 +17740,7 @@
         </w:rPr>
         <w:t xml:space="preserve">where accelerated cathodic oxygen consumption reduced interfacial oxygen concentrations despite only modest changes in </w:t>
       </w:r>
-      <w:del w:id="9115" w:author="Claude" w:date="2026-10-08T03:09:32Z">
+      <w:del w:id="9115" w:author="Claude" w:date="2026-10-08T04:28:24Z">
         <w:r>
           <w:rPr>
             <w:rFonts w:cs="Times New Roman"/>
@@ -17748,7 +17748,7 @@
           <w:delText xml:space="preserve">film</w:delText>
         </w:r>
       </w:del>
-      <w:ins w:id="9114" w:author="Claude" w:date="2026-10-08T03:09:32Z">
+      <w:ins w:id="9114" w:author="Claude" w:date="2026-10-08T04:28:24Z">
         <w:r>
           <w:rPr>
             <w:rFonts w:cs="Times New Roman"/>
@@ -17762,7 +17762,7 @@
         </w:rPr>
         <w:t xml:space="preserve"> </w:t>
       </w:r>
-      <w:del w:id="9113" w:author="Claude" w:date="2026-10-08T03:09:32Z">
+      <w:del w:id="9113" w:author="Claude" w:date="2026-10-08T04:28:24Z">
         <w:r>
           <w:rPr>
             <w:rFonts w:cs="Times New Roman"/>
@@ -17770,7 +17770,7 @@
           <w:delText xml:space="preserve">coverage</w:delText>
         </w:r>
       </w:del>
-      <w:ins w:id="9112" w:author="Claude" w:date="2026-10-08T03:09:32Z">
+      <w:ins w:id="9112" w:author="Claude" w:date="2026-10-08T04:28:24Z">
         <w:r>
           <w:rPr>
             <w:rFonts w:cs="Times New Roman"/>
@@ -18042,12 +18042,12 @@
       <w:r>
         <w:t xml:space="preserve"> Local parameter sweeps of kinetic parameters. Panels (a–c) show cumulative mass loss (%), panels (d–f) show </w:t>
       </w:r>
-      <w:del w:id="9130" w:author="Claude" w:date="2026-10-08T03:09:32Z">
+      <w:del w:id="9130" w:author="Claude" w:date="2026-10-08T04:28:24Z">
         <w:r>
           <w:delText xml:space="preserve">film</w:delText>
         </w:r>
       </w:del>
-      <w:ins w:id="9129" w:author="Claude" w:date="2026-10-08T03:09:32Z">
+      <w:ins w:id="9129" w:author="Claude" w:date="2026-10-08T04:28:24Z">
         <w:r>
           <w:t xml:space="preserve">the</w:t>
         </w:r>
@@ -18055,12 +18055,12 @@
       <w:r>
         <w:t xml:space="preserve"> </w:t>
       </w:r>
-      <w:del w:id="9128" w:author="Claude" w:date="2026-10-08T03:09:32Z">
+      <w:del w:id="9128" w:author="Claude" w:date="2026-10-08T04:28:24Z">
         <w:r>
           <w:delText xml:space="preserve">coverage</w:delText>
         </w:r>
       </w:del>
-      <w:ins w:id="9127" w:author="Claude" w:date="2026-10-08T03:09:32Z">
+      <w:ins w:id="9127" w:author="Claude" w:date="2026-10-08T04:28:24Z">
         <w:r>
           <w:t xml:space="preserve">normalized corrosion-product saturation, F/Fₘₐₓ</w:t>
         </w:r>
@@ -18068,12 +18068,12 @@
       <w:r>
         <w:t xml:space="preserve"> (%), and panels (g</w:t>
       </w:r>
-      <w:del w:id="9126" w:author="Claude" w:date="2026-10-08T03:09:32Z">
+      <w:del w:id="9126" w:author="Claude" w:date="2026-10-08T04:28:24Z">
         <w:r>
           <w:delText xml:space="preserve">-</w:delText>
         </w:r>
       </w:del>
-      <w:ins w:id="9125" w:author="Claude" w:date="2026-10-08T03:09:32Z">
+      <w:ins w:id="9125" w:author="Claude" w:date="2026-10-08T04:28:24Z">
         <w:r>
           <w:t xml:space="preserve">–</w:t>
         </w:r>
@@ -19309,7 +19309,7 @@
         </w:rPr>
         <w:t xml:space="preserve">), with an RMSE of 0.0159% and </w:t>
       </w:r>
-      <w:del w:id="9132" w:author="Claude" w:date="2026-10-08T03:09:32Z">
+      <w:del w:id="9132" w:author="Claude" w:date="2026-10-08T04:28:24Z">
         <w:r>
           <w:rPr>
             <w:rFonts w:cs="Times New Roman"/>
@@ -19317,7 +19317,7 @@
           <w:delText xml:space="preserve">a</w:delText>
         </w:r>
       </w:del>
-      <w:ins w:id="9131" w:author="Claude" w:date="2026-10-08T03:09:32Z">
+      <w:ins w:id="9131" w:author="Claude" w:date="2026-10-08T04:28:24Z">
         <w:r>
           <w:rPr>
             <w:rFonts w:cs="Times New Roman"/>
@@ -19552,7 +19552,7 @@
         </w:rPr>
         <w:t xml:space="preserve">Corrosion products progressively accumulated near the Zn surface, forming a </w:t>
       </w:r>
-      <w:del w:id="9150" w:author="Claude" w:date="2026-10-08T03:09:32Z">
+      <w:del w:id="9150" w:author="Claude" w:date="2026-10-08T04:28:24Z">
         <w:r>
           <w:rPr>
             <w:rFonts w:cs="Times New Roman"/>
@@ -19560,7 +19560,7 @@
           <w:delText xml:space="preserve">distinct</w:delText>
         </w:r>
       </w:del>
-      <w:ins w:id="9149" w:author="Claude" w:date="2026-10-08T03:09:32Z">
+      <w:ins w:id="9149" w:author="Claude" w:date="2026-10-08T04:28:24Z">
         <w:r>
           <w:rPr>
             <w:rFonts w:cs="Times New Roman"/>
@@ -19574,7 +19574,7 @@
         </w:rPr>
         <w:t xml:space="preserve"> </w:t>
       </w:r>
-      <w:del w:id="9148" w:author="Claude" w:date="2026-10-08T03:09:32Z">
+      <w:del w:id="9148" w:author="Claude" w:date="2026-10-08T04:28:24Z">
         <w:r>
           <w:rPr>
             <w:rFonts w:cs="Times New Roman"/>
@@ -19582,7 +19582,7 @@
           <w:delText xml:space="preserve">film</w:delText>
         </w:r>
       </w:del>
-      <w:ins w:id="9147" w:author="Claude" w:date="2026-10-08T03:09:32Z">
+      <w:ins w:id="9147" w:author="Claude" w:date="2026-10-08T04:28:24Z">
         <w:r>
           <w:rPr>
             <w:rFonts w:cs="Times New Roman"/>
@@ -19596,7 +19596,7 @@
         </w:rPr>
         <w:t xml:space="preserve"> </w:t>
       </w:r>
-      <w:del w:id="9146" w:author="Claude" w:date="2026-10-08T03:09:32Z">
+      <w:del w:id="9146" w:author="Claude" w:date="2026-10-08T04:28:24Z">
         <w:r>
           <w:rPr>
             <w:rFonts w:cs="Times New Roman"/>
@@ -19604,7 +19604,7 @@
           <w:delText xml:space="preserve">layer</w:delText>
         </w:r>
       </w:del>
-      <w:ins w:id="9145" w:author="Claude" w:date="2026-10-08T03:09:32Z">
+      <w:ins w:id="9145" w:author="Claude" w:date="2026-10-08T04:28:24Z">
         <w:r>
           <w:rPr>
             <w:rFonts w:cs="Times New Roman"/>
@@ -19618,7 +19618,7 @@
         </w:rPr>
         <w:t xml:space="preserve"> by 168 h and developing into a </w:t>
       </w:r>
-      <w:del w:id="9144" w:author="Claude" w:date="2026-10-08T03:09:32Z">
+      <w:del w:id="9144" w:author="Claude" w:date="2026-10-08T04:28:24Z">
         <w:r>
           <w:rPr>
             <w:rFonts w:cs="Times New Roman"/>
@@ -19626,7 +19626,7 @@
           <w:delText xml:space="preserve">dense</w:delText>
         </w:r>
       </w:del>
-      <w:ins w:id="9143" w:author="Claude" w:date="2026-10-08T03:09:32Z">
+      <w:ins w:id="9143" w:author="Claude" w:date="2026-10-08T04:28:24Z">
         <w:r>
           <w:rPr>
             <w:rFonts w:cs="Times New Roman"/>
@@ -19640,7 +19640,7 @@
         </w:rPr>
         <w:t xml:space="preserve"> </w:t>
       </w:r>
-      <w:del w:id="9142" w:author="Claude" w:date="2026-10-08T03:09:32Z">
+      <w:del w:id="9142" w:author="Claude" w:date="2026-10-08T04:28:24Z">
         <w:r>
           <w:rPr>
             <w:rFonts w:cs="Times New Roman"/>
@@ -19648,7 +19648,7 @@
           <w:delText xml:space="preserve">near</w:delText>
         </w:r>
       </w:del>
-      <w:ins w:id="9141" w:author="Claude" w:date="2026-10-08T03:09:32Z">
+      <w:ins w:id="9141" w:author="Claude" w:date="2026-10-08T04:28:24Z">
         <w:r>
           <w:rPr>
             <w:rFonts w:cs="Times New Roman"/>
@@ -19662,7 +19662,7 @@
         </w:rPr>
         <w:t xml:space="preserve">-</w:t>
       </w:r>
-      <w:del w:id="9140" w:author="Claude" w:date="2026-10-08T03:09:32Z">
+      <w:del w:id="9140" w:author="Claude" w:date="2026-10-08T04:28:24Z">
         <w:r>
           <w:rPr>
             <w:rFonts w:cs="Times New Roman"/>
@@ -19670,7 +19670,7 @@
           <w:delText xml:space="preserve">surface</w:delText>
         </w:r>
       </w:del>
-      <w:ins w:id="9139" w:author="Claude" w:date="2026-10-08T03:09:32Z">
+      <w:ins w:id="9139" w:author="Claude" w:date="2026-10-08T04:28:24Z">
         <w:r>
           <w:rPr>
             <w:rFonts w:cs="Times New Roman"/>
@@ -19751,7 +19751,7 @@
         </w:rPr>
         <w:t xml:space="preserve">). As the </w:t>
       </w:r>
-      <w:del w:id="9138" w:author="Claude" w:date="2026-10-08T03:09:32Z">
+      <w:del w:id="9138" w:author="Claude" w:date="2026-10-08T04:28:24Z">
         <w:r>
           <w:rPr>
             <w:rFonts w:cs="Times New Roman"/>
@@ -19759,7 +19759,7 @@
           <w:delText xml:space="preserve">film</w:delText>
         </w:r>
       </w:del>
-      <w:ins w:id="9137" w:author="Claude" w:date="2026-10-08T03:09:32Z">
+      <w:ins w:id="9137" w:author="Claude" w:date="2026-10-08T04:28:24Z">
         <w:r>
           <w:rPr>
             <w:rFonts w:cs="Times New Roman"/>
@@ -19773,7 +19773,7 @@
         </w:rPr>
         <w:t xml:space="preserve"> </w:t>
       </w:r>
-      <w:del w:id="9136" w:author="Claude" w:date="2026-10-08T03:09:32Z">
+      <w:del w:id="9136" w:author="Claude" w:date="2026-10-08T04:28:24Z">
         <w:r>
           <w:rPr>
             <w:rFonts w:cs="Times New Roman"/>
@@ -19781,7 +19781,7 @@
           <w:delText xml:space="preserve">thickened</w:delText>
         </w:r>
       </w:del>
-      <w:ins w:id="9135" w:author="Claude" w:date="2026-10-08T03:09:32Z">
+      <w:ins w:id="9135" w:author="Claude" w:date="2026-10-08T04:28:24Z">
         <w:r>
           <w:rPr>
             <w:rFonts w:cs="Times New Roman"/>
@@ -19874,7 +19874,7 @@
         </w:rPr>
         <w:t xml:space="preserve">). The oxygen-deficient boundary layer expanded with immersion time, while radial concentration variations remained small, indicating predominantly one-dimensional transport normal to the surface. The combined effects of </w:t>
       </w:r>
-      <w:del w:id="9134" w:author="Claude" w:date="2026-10-08T03:09:32Z">
+      <w:del w:id="9134" w:author="Claude" w:date="2026-10-08T04:28:24Z">
         <w:r>
           <w:rPr>
             <w:rFonts w:cs="Times New Roman"/>
@@ -19882,7 +19882,7 @@
           <w:delText xml:space="preserve">film</w:delText>
         </w:r>
       </w:del>
-      <w:ins w:id="9133" w:author="Claude" w:date="2026-10-08T03:09:32Z">
+      <w:ins w:id="9133" w:author="Claude" w:date="2026-10-08T04:28:24Z">
         <w:r>
           <w:rPr>
             <w:rFonts w:cs="Times New Roman"/>
@@ -20219,7 +20219,7 @@
         </w:rPr>
         <w:t xml:space="preserve">In addition to mass-loss validation, the model was evaluated against </w:t>
       </w:r>
-      <w:del w:id="9166" w:author="Claude" w:date="2026-10-08T03:09:32Z">
+      <w:del w:id="9166" w:author="Claude" w:date="2026-10-08T04:28:24Z">
         <w:r>
           <w:rPr>
             <w:rFonts w:cs="Times New Roman"/>
@@ -20227,7 +20227,7 @@
           <w:delText xml:space="preserve">Literature</w:delText>
         </w:r>
       </w:del>
-      <w:ins w:id="9165" w:author="Claude" w:date="2026-10-08T03:09:32Z">
+      <w:ins w:id="9165" w:author="Claude" w:date="2026-10-08T04:28:24Z">
         <w:r>
           <w:rPr>
             <w:rFonts w:cs="Times New Roman"/>
@@ -20439,7 +20439,7 @@
         </w:rPr>
         <w:t xml:space="preserve">, the model reproduced the overall evolution of both quantities, capturing the rapid initial increase followed by a gradual plateau</w:t>
       </w:r>
-      <w:ins w:id="9164" w:author="Claude" w:date="2026-10-08T03:09:32Z">
+      <w:ins w:id="9164" w:author="Claude" w:date="2026-10-08T04:28:24Z">
         <w:r>
           <w:rPr>
             <w:rFonts w:cs="Times New Roman"/>
@@ -20453,7 +20453,7 @@
         </w:rPr>
         <w:t xml:space="preserve"> </w:t>
       </w:r>
-      <w:del w:id="9163" w:author="Claude" w:date="2026-10-08T03:09:32Z">
+      <w:del w:id="9163" w:author="Claude" w:date="2026-10-08T04:28:24Z">
         <w:r>
           <w:rPr>
             <w:rFonts w:cs="Times New Roman"/>
@@ -20461,7 +20461,7 @@
           <w:delText xml:space="preserve">(Pearson</w:delText>
         </w:r>
       </w:del>
-      <w:ins w:id="9162" w:author="Claude" w:date="2026-10-08T03:09:32Z">
+      <w:ins w:id="9162" w:author="Claude" w:date="2026-10-08T04:28:24Z">
         <w:r>
           <w:rPr>
             <w:rFonts w:cs="Times New Roman"/>
@@ -20475,7 +20475,7 @@
         </w:rPr>
         <w:t xml:space="preserve"> </w:t>
       </w:r>
-      <w:del w:id="9161" w:author="Claude" w:date="2026-10-08T03:09:32Z">
+      <w:del w:id="9161" w:author="Claude" w:date="2026-10-08T04:28:24Z">
         <w:r>
           <w:rPr>
             <w:rFonts w:cs="Times New Roman"/>
@@ -20483,7 +20483,7 @@
           <w:delText xml:space="preserve">r</w:delText>
         </w:r>
       </w:del>
-      <w:ins w:id="9160" w:author="Claude" w:date="2026-10-08T03:09:32Z">
+      <w:ins w:id="9160" w:author="Claude" w:date="2026-10-08T04:28:24Z">
         <w:r>
           <w:rPr>
             <w:rFonts w:cs="Times New Roman"/>
@@ -20497,7 +20497,7 @@
         </w:rPr>
         <w:t xml:space="preserve"> </w:t>
       </w:r>
-      <w:del w:id="9159" w:author="Claude" w:date="2026-10-08T03:09:32Z">
+      <w:del w:id="9159" w:author="Claude" w:date="2026-10-08T04:28:24Z">
         <w:r>
           <w:rPr>
             <w:rFonts w:cs="Times New Roman"/>
@@ -20505,7 +20505,7 @@
           <w:delText xml:space="preserve">=</w:delText>
         </w:r>
       </w:del>
-      <w:ins w:id="9158" w:author="Claude" w:date="2026-10-08T03:09:32Z">
+      <w:ins w:id="9158" w:author="Claude" w:date="2026-10-08T04:28:24Z">
         <w:r>
           <w:rPr>
             <w:rFonts w:cs="Times New Roman"/>
@@ -20519,7 +20519,7 @@
         </w:rPr>
         <w:t xml:space="preserve"> </w:t>
       </w:r>
-      <w:del w:id="9157" w:author="Claude" w:date="2026-10-08T03:09:32Z">
+      <w:del w:id="9157" w:author="Claude" w:date="2026-10-08T04:28:24Z">
         <w:r>
           <w:rPr>
             <w:rFonts w:cs="Times New Roman"/>
@@ -20527,7 +20527,7 @@
           <w:delText xml:space="preserve">0.96</w:delText>
         </w:r>
       </w:del>
-      <w:ins w:id="9156" w:author="Claude" w:date="2026-10-08T03:09:32Z">
+      <w:ins w:id="9156" w:author="Claude" w:date="2026-10-08T04:28:24Z">
         <w:r>
           <w:rPr>
             <w:rFonts w:cs="Times New Roman"/>
@@ -20541,7 +20541,7 @@
         </w:rPr>
         <w:t xml:space="preserve"> for Zn²⁺ and </w:t>
       </w:r>
-      <w:del w:id="9155" w:author="Claude" w:date="2026-10-08T03:09:32Z">
+      <w:del w:id="9155" w:author="Claude" w:date="2026-10-08T04:28:24Z">
         <w:r>
           <w:rPr>
             <w:rFonts w:cs="Times New Roman"/>
@@ -20549,7 +20549,7 @@
           <w:delText xml:space="preserve">0</w:delText>
         </w:r>
       </w:del>
-      <w:ins w:id="9154" w:author="Claude" w:date="2026-10-08T03:09:32Z">
+      <w:ins w:id="9154" w:author="Claude" w:date="2026-10-08T04:28:24Z">
         <w:r>
           <w:rPr>
             <w:rFonts w:cs="Times New Roman"/>
@@ -20563,7 +20563,7 @@
         </w:rPr>
         <w:t xml:space="preserve">.</w:t>
       </w:r>
-      <w:del w:id="9153" w:author="Claude" w:date="2026-10-08T03:09:32Z">
+      <w:del w:id="9153" w:author="Claude" w:date="2026-10-08T04:28:24Z">
         <w:r>
           <w:rPr>
             <w:rFonts w:cs="Times New Roman"/>
@@ -20571,7 +20571,7 @@
           <w:delText xml:space="preserve">95</w:delText>
         </w:r>
       </w:del>
-      <w:ins w:id="9152" w:author="Claude" w:date="2026-10-08T03:09:32Z">
+      <w:ins w:id="9152" w:author="Claude" w:date="2026-10-08T04:28:24Z">
         <w:r>
           <w:rPr>
             <w:rFonts w:cs="Times New Roman"/>
@@ -20597,7 +20597,7 @@
         </w:rPr>
         <w:t xml:space="preserve"/>
       </w:r>
-      <w:del w:id="9151" w:author="Claude" w:date="2026-10-08T03:09:32Z">
+      <w:del w:id="9151" w:author="Claude" w:date="2026-10-08T04:28:24Z">
         <w:r>
           <w:rPr>
             <w:rFonts w:cs="Times New Roman"/>
@@ -21902,12 +21902,12 @@
       <w:r>
         <w:t xml:space="preserve">penetration depths varied only slightly, ranging from approximately 2.</w:t>
       </w:r>
-      <w:del w:id="9170" w:author="Claude" w:date="2026-10-08T03:09:32Z">
+      <w:del w:id="9170" w:author="Claude" w:date="2026-10-08T04:28:24Z">
         <w:r>
           <w:delText xml:space="preserve">1</w:delText>
         </w:r>
       </w:del>
-      <w:ins w:id="9169" w:author="Claude" w:date="2026-10-08T03:09:32Z">
+      <w:ins w:id="9169" w:author="Claude" w:date="2026-10-08T04:28:24Z">
         <w:r>
           <w:t xml:space="preserve">4</w:t>
         </w:r>
@@ -21915,12 +21915,12 @@
       <w:r>
         <w:t xml:space="preserve"> to 2.7 µm across the curved-wire configurations (30°, 90°, and 150° arcs) and from 2.1 to 2.</w:t>
       </w:r>
-      <w:del w:id="9168" w:author="Claude" w:date="2026-10-08T03:09:32Z">
+      <w:del w:id="9168" w:author="Claude" w:date="2026-10-08T04:28:24Z">
         <w:r>
           <w:delText xml:space="preserve">7</w:delText>
         </w:r>
       </w:del>
-      <w:ins w:id="9167" w:author="Claude" w:date="2026-10-08T03:09:32Z">
+      <w:ins w:id="9167" w:author="Claude" w:date="2026-10-08T04:28:24Z">
         <w:r>
           <w:t xml:space="preserve">4</w:t>
         </w:r>
@@ -22097,7 +22097,7 @@
       <w:r>
         <w:t xml:space="preserve">mean local penetration depth for the corresponding curvature and spacing configurations</w:t>
       </w:r>
-      <w:ins w:id="9171" w:author="Claude" w:date="2026-10-08T03:09:32Z">
+      <w:ins w:id="9171" w:author="Claude" w:date="2026-10-08T04:28:24Z">
         <w:r>
           <w:t xml:space="preserve"> (error bars: ±1 SD around the cross-section perimeter)</w:t>
         </w:r>
@@ -22136,7 +22136,7 @@
       <w:r>
         <w:t xml:space="preserve">The corrosion</w:t>
       </w:r>
-      <w:del w:id="9180" w:author="Claude" w:date="2026-10-08T03:09:32Z">
+      <w:del w:id="9180" w:author="Claude" w:date="2026-10-08T04:28:24Z">
         <w:r>
           <w:delText xml:space="preserve">-product</w:delText>
         </w:r>
@@ -22144,12 +22144,12 @@
       <w:r>
         <w:t xml:space="preserve"> </w:t>
       </w:r>
-      <w:del w:id="9179" w:author="Claude" w:date="2026-10-08T03:09:32Z">
+      <w:del w:id="9179" w:author="Claude" w:date="2026-10-08T04:28:24Z">
         <w:r>
           <w:delText xml:space="preserve">layer</w:delText>
         </w:r>
       </w:del>
-      <w:ins w:id="9178" w:author="Claude" w:date="2026-10-08T03:09:32Z">
+      <w:ins w:id="9178" w:author="Claude" w:date="2026-10-08T04:28:24Z">
         <w:r>
           <w:t xml:space="preserve">products</w:t>
         </w:r>
@@ -22157,12 +22157,12 @@
       <w:r>
         <w:t xml:space="preserve"> </w:t>
       </w:r>
-      <w:del w:id="9177" w:author="Claude" w:date="2026-10-08T03:09:32Z">
+      <w:del w:id="9177" w:author="Claude" w:date="2026-10-08T04:28:24Z">
         <w:r>
           <w:delText xml:space="preserve">is</w:delText>
         </w:r>
       </w:del>
-      <w:ins w:id="9176" w:author="Claude" w:date="2026-10-08T03:09:32Z">
+      <w:ins w:id="9176" w:author="Claude" w:date="2026-10-08T04:28:24Z">
         <w:r>
           <w:t xml:space="preserve">are</w:t>
         </w:r>
@@ -22170,12 +22170,12 @@
       <w:r>
         <w:t xml:space="preserve"> treated as a homogenized ZnO-based </w:t>
       </w:r>
-      <w:del w:id="9175" w:author="Claude" w:date="2026-10-08T03:09:32Z">
+      <w:del w:id="9175" w:author="Claude" w:date="2026-10-08T04:28:24Z">
         <w:r>
           <w:delText xml:space="preserve">film</w:delText>
         </w:r>
       </w:del>
-      <w:ins w:id="9174" w:author="Claude" w:date="2026-10-08T03:09:32Z">
+      <w:ins w:id="9174" w:author="Claude" w:date="2026-10-08T04:28:24Z">
         <w:r>
           <w:t xml:space="preserve">field</w:t>
         </w:r>
@@ -22183,7 +22183,7 @@
       <w:r>
         <w:t xml:space="preserve"> rather than</w:t>
       </w:r>
-      <w:ins w:id="9173" w:author="Claude" w:date="2026-10-08T03:09:32Z">
+      <w:ins w:id="9173" w:author="Claude" w:date="2026-10-08T04:28:24Z">
         <w:r>
           <w:t xml:space="preserve"> a discrete surface film or</w:t>
         </w:r>
@@ -22191,7 +22191,7 @@
       <w:r>
         <w:t xml:space="preserve"> a heterogeneous, composition-dependent structure</w:t>
       </w:r>
-      <w:ins w:id="9172" w:author="Claude" w:date="2026-10-08T03:09:32Z">
+      <w:ins w:id="9172" w:author="Claude" w:date="2026-10-08T04:28:24Z">
         <w:r>
           <w:t xml:space="preserve">. The dissolved oxygen concentration (3.5 mg L⁻¹) was taken from literature values for body fluids and was not measured in the immersion experiments; because it is strongly coupled to the ORR rate coefficient, the calibrated k_ORR should be regarded as an effective parameter that may also absorb uncertainty in the oxygen supply</w:t>
         </w:r>
@@ -22257,12 +22257,12 @@
       <w:r>
         <w:t xml:space="preserve">Future developments should incorporate physiologically realistic flow conditions, additional ionic species, multiphase corrosion-product evolution, and spatially heterogeneous electrochemical activity. Extending the framework to Zn alloys will also require accounting for alloying elements, secondary phases, and galvanic interactions. Although the </w:t>
       </w:r>
-      <w:del w:id="9185" w:author="Claude" w:date="2026-10-08T03:09:32Z">
+      <w:del w:id="9185" w:author="Claude" w:date="2026-10-08T04:28:24Z">
         <w:r>
           <w:delText xml:space="preserve">current physics</w:delText>
         </w:r>
       </w:del>
-      <w:ins w:id="9184" w:author="Claude" w:date="2026-10-08T03:09:32Z">
+      <w:ins w:id="9184" w:author="Claude" w:date="2026-10-08T04:28:24Z">
         <w:r>
           <w:t xml:space="preserve">high</w:t>
         </w:r>
@@ -22270,12 +22270,12 @@
       <w:r>
         <w:t xml:space="preserve">-</w:t>
       </w:r>
-      <w:del w:id="9183" w:author="Claude" w:date="2026-10-08T03:09:32Z">
+      <w:del w:id="9183" w:author="Claude" w:date="2026-10-08T04:28:24Z">
         <w:r>
           <w:delText xml:space="preserve">based</w:delText>
         </w:r>
       </w:del>
-      <w:ins w:id="9182" w:author="Claude" w:date="2026-10-08T03:09:32Z">
+      <w:ins w:id="9182" w:author="Claude" w:date="2026-10-08T04:28:24Z">
         <w:r>
           <w:t xml:space="preserve">fidelity</w:t>
         </w:r>
@@ -22283,7 +22283,7 @@
       <w:r>
         <w:t xml:space="preserve"> simulations remain computationally demanding</w:t>
       </w:r>
-      <w:ins w:id="9181" w:author="Claude" w:date="2026-10-08T03:09:32Z">
+      <w:ins w:id="9181" w:author="Claude" w:date="2026-10-08T04:28:24Z">
         <w:r>
           <w:t xml:space="preserve"> (about 69 h on 50–64 cores for a 672 h simulation on a 19–21 million-element mesh; Table S4)</w:t>
         </w:r>
@@ -22394,12 +22394,12 @@
       <w:r>
         <w:t xml:space="preserve">Zn biodegradation under physiological conditions becomes an oxygen-transport-controlled process after an initial reaction-controlled stage in which implant geometry governs the spatial evolution of material loss. The proposed 3D reaction-diffusion model closely reproduced independent 28-day immersion data (RMSE = 0.0159%) and, without further calibration, predicted approximately 6% mass loss for a six-crown stent, </w:t>
       </w:r>
-      <w:del w:id="9189" w:author="Claude" w:date="2026-10-08T03:09:32Z">
+      <w:del w:id="9189" w:author="Claude" w:date="2026-10-08T04:28:24Z">
         <w:r>
           <w:delText xml:space="preserve">consistent</w:delText>
         </w:r>
       </w:del>
-      <w:ins w:id="9188" w:author="Claude" w:date="2026-10-08T03:09:32Z">
+      <w:ins w:id="9188" w:author="Claude" w:date="2026-10-08T04:28:24Z">
         <w:r>
           <w:t xml:space="preserve">of</w:t>
         </w:r>
@@ -22407,12 +22407,12 @@
       <w:r>
         <w:t xml:space="preserve"> </w:t>
       </w:r>
-      <w:del w:id="9187" w:author="Claude" w:date="2026-10-08T03:09:32Z">
+      <w:del w:id="9187" w:author="Claude" w:date="2026-10-08T04:28:24Z">
         <w:r>
           <w:delText xml:space="preserve">with</w:delText>
         </w:r>
       </w:del>
-      <w:ins w:id="9186" w:author="Claude" w:date="2026-10-08T03:09:32Z">
+      <w:ins w:id="9186" w:author="Claude" w:date="2026-10-08T04:28:24Z">
         <w:r>
           <w:t xml:space="preserve">the same order of magnitude as</w:t>
         </w:r>

</xml_diff>